<commit_message>
Add prompt time fields to AI audit report
</commit_message>
<xml_diff>
--- a/HW#01 - Job Description/[AI-02] - FIT@HCMUS - AI Audit Report_Vn_filled.docx
+++ b/HW#01 - Job Description/[AI-02] - FIT@HCMUS - AI Audit Report_Vn_filled.docx
@@ -829,12 +829,10 @@
             <w:tcW w:w="2154" w:type="dxa"/>
           </w:tcPr>
           <w:p>
-            <w:r/>
             <w:r>
               <w:rPr>
                 <w:rFonts w:ascii="Times New Roman" w:hAnsi="Times New Roman" w:eastAsia="Times New Roman"/>
-                <w:b/>
-                <w:i w:val="0"/>
+                <w:b w:val="0"/>
                 <w:sz w:val="26"/>
               </w:rPr>
               <w:t>Artifact #1</w:t>
@@ -846,6 +844,8 @@
               <w:t>Công cụ: ChatGPT/Codex</w:t>
               <w:br/>
               <w:t>Thời điểm: theo prompt log</w:t>
+              <w:br/>
+              <w:t>Thời gian: 24–26/09/2026 (timestamp chi tiết đối chiếu Prompt log)</w:t>
             </w:r>
           </w:p>
         </w:tc>
@@ -928,12 +928,10 @@
             <w:tcW w:w="2154" w:type="dxa"/>
           </w:tcPr>
           <w:p>
-            <w:r/>
             <w:r>
               <w:rPr>
                 <w:rFonts w:ascii="Times New Roman" w:hAnsi="Times New Roman" w:eastAsia="Times New Roman"/>
-                <w:b/>
-                <w:i w:val="0"/>
+                <w:b w:val="0"/>
                 <w:sz w:val="26"/>
               </w:rPr>
               <w:t>Artifact #2</w:t>
@@ -941,6 +939,8 @@
               <w:t>Requirement 1 – dịch Job Description/Required Skills/Salary</w:t>
               <w:br/>
               <w:t>Prompt: yêu cầu dịch phần Job Description và Required Skills sang tiếng Việt, không thay đổi nội dung.</w:t>
+              <w:br/>
+              <w:t>Thời gian: 24–26/09/2026 (timestamp chi tiết đối chiếu Prompt log)</w:t>
             </w:r>
           </w:p>
         </w:tc>
@@ -1023,12 +1023,10 @@
             <w:tcW w:w="2154" w:type="dxa"/>
           </w:tcPr>
           <w:p>
-            <w:r/>
             <w:r>
               <w:rPr>
                 <w:rFonts w:ascii="Times New Roman" w:hAnsi="Times New Roman" w:eastAsia="Times New Roman"/>
-                <w:b/>
-                <w:i w:val="0"/>
+                <w:b w:val="0"/>
                 <w:sz w:val="26"/>
               </w:rPr>
               <w:t>Artifact #3</w:t>
@@ -1036,6 +1034,8 @@
               <w:t>Requirement 1 – AI Impact Analysis</w:t>
               <w:br/>
               <w:t>Prompt: viết 1–2 câu AI Impact Analysis, nêu AI hỗ trợ gì cho job và năng lực job giúp gì khi kết hợp AI.</w:t>
+              <w:br/>
+              <w:t>Thời gian: 24–26/09/2026 (timestamp chi tiết đối chiếu Prompt log)</w:t>
             </w:r>
           </w:p>
         </w:tc>
@@ -1118,12 +1118,10 @@
             <w:tcW w:w="2154" w:type="dxa"/>
           </w:tcPr>
           <w:p>
-            <w:r/>
             <w:r>
               <w:rPr>
                 <w:rFonts w:ascii="Times New Roman" w:hAnsi="Times New Roman" w:eastAsia="Times New Roman"/>
-                <w:b/>
-                <w:i w:val="0"/>
+                <w:b w:val="0"/>
                 <w:sz w:val="26"/>
               </w:rPr>
               <w:t>Artifact #4</w:t>
@@ -1131,6 +1129,8 @@
               <w:t>Requirement 1 – kiểm tra tuân thủ</w:t>
               <w:br/>
               <w:t>Prompt: kiểm tra JD đầu tiên đã đúng Requirement 1 chưa.</w:t>
+              <w:br/>
+              <w:t>Thời gian: 24–26/09/2026 (timestamp chi tiết đối chiếu Prompt log)</w:t>
             </w:r>
           </w:p>
         </w:tc>
@@ -1213,12 +1213,10 @@
             <w:tcW w:w="2154" w:type="dxa"/>
           </w:tcPr>
           <w:p>
-            <w:r/>
             <w:r>
               <w:rPr>
                 <w:rFonts w:ascii="Times New Roman" w:hAnsi="Times New Roman" w:eastAsia="Times New Roman"/>
-                <w:b/>
-                <w:i w:val="0"/>
+                <w:b w:val="0"/>
                 <w:sz w:val="26"/>
               </w:rPr>
               <w:t>Artifact #5</w:t>
@@ -1226,6 +1224,8 @@
               <w:t>Requirement 2 – tìm software defects</w:t>
               <w:br/>
               <w:t>Prompt: tìm software defects publicized between 2022 and 2026.</w:t>
+              <w:br/>
+              <w:t>Thời gian: 24–26/09/2026 (timestamp chi tiết đối chiếu Prompt log)</w:t>
             </w:r>
           </w:p>
         </w:tc>
@@ -1308,12 +1308,10 @@
             <w:tcW w:w="2154" w:type="dxa"/>
           </w:tcPr>
           <w:p>
-            <w:r/>
             <w:r>
               <w:rPr>
                 <w:rFonts w:ascii="Times New Roman" w:hAnsi="Times New Roman" w:eastAsia="Times New Roman"/>
-                <w:b/>
-                <w:i w:val="0"/>
+                <w:b w:val="0"/>
                 <w:sz w:val="26"/>
               </w:rPr>
               <w:t>Artifact #6</w:t>
@@ -1321,6 +1319,8 @@
               <w:t>Requirement 2 – mô tả defect</w:t>
               <w:br/>
               <w:t>Prompt: mỗi defect gồm source link, description, severity, consequences, solution.</w:t>
+              <w:br/>
+              <w:t>Thời gian: 24–26/09/2026 (timestamp chi tiết đối chiếu Prompt log)</w:t>
             </w:r>
           </w:p>
         </w:tc>
@@ -1403,12 +1403,10 @@
             <w:tcW w:w="2154" w:type="dxa"/>
           </w:tcPr>
           <w:p>
-            <w:r/>
             <w:r>
               <w:rPr>
                 <w:rFonts w:ascii="Times New Roman" w:hAnsi="Times New Roman" w:eastAsia="Times New Roman"/>
-                <w:b/>
-                <w:i w:val="0"/>
+                <w:b w:val="0"/>
                 <w:sz w:val="26"/>
               </w:rPr>
               <w:t>Artifact #7</w:t>
@@ -1416,6 +1414,8 @@
               <w:t>Requirement 2 – severity/consequences</w:t>
               <w:br/>
               <w:t>Prompt: kiểm tra mức độ nghiêm trọng và hậu quả của từng defect.</w:t>
+              <w:br/>
+              <w:t>Thời gian: 24–26/09/2026 (timestamp chi tiết đối chiếu Prompt log)</w:t>
             </w:r>
           </w:p>
         </w:tc>
@@ -1498,12 +1498,10 @@
             <w:tcW w:w="2154" w:type="dxa"/>
           </w:tcPr>
           <w:p>
-            <w:r/>
             <w:r>
               <w:rPr>
                 <w:rFonts w:ascii="Times New Roman" w:hAnsi="Times New Roman" w:eastAsia="Times New Roman"/>
-                <w:b/>
-                <w:i w:val="0"/>
+                <w:b w:val="0"/>
                 <w:sz w:val="26"/>
               </w:rPr>
               <w:t>Artifact #8</w:t>
@@ -1511,6 +1509,8 @@
               <w:t>Requirement 2 – solution và source solution</w:t>
               <w:br/>
               <w:t>Prompt: solution phải ghi cơ chế đã áp dụng để fix, không chỉ ghi update version; sửa link 404/homepage.</w:t>
+              <w:br/>
+              <w:t>Thời gian: 24–26/09/2026 (timestamp chi tiết đối chiếu Prompt log)</w:t>
             </w:r>
           </w:p>
         </w:tc>
@@ -1593,12 +1593,10 @@
             <w:tcW w:w="2154" w:type="dxa"/>
           </w:tcPr>
           <w:p>
-            <w:r/>
             <w:r>
               <w:rPr>
                 <w:rFonts w:ascii="Times New Roman" w:hAnsi="Times New Roman" w:eastAsia="Times New Roman"/>
-                <w:b/>
-                <w:i w:val="0"/>
+                <w:b w:val="0"/>
                 <w:sz w:val="26"/>
               </w:rPr>
               <w:t>Artifact #9</w:t>
@@ -1606,6 +1604,8 @@
               <w:t>AI Hallucination Analysis – Defect 10 và 14</w:t>
               <w:br/>
               <w:t>Prompt: phân tích nơi AI biased hoặc hallucinates khi giải thích defect.</w:t>
+              <w:br/>
+              <w:t>Thời gian: 24–26/09/2026 (timestamp chi tiết đối chiếu Prompt log)</w:t>
             </w:r>
           </w:p>
         </w:tc>
@@ -1688,12 +1688,10 @@
             <w:tcW w:w="2154" w:type="dxa"/>
           </w:tcPr>
           <w:p>
-            <w:r/>
             <w:r>
               <w:rPr>
                 <w:rFonts w:ascii="Times New Roman" w:hAnsi="Times New Roman" w:eastAsia="Times New Roman"/>
-                <w:b/>
-                <w:i w:val="0"/>
+                <w:b w:val="0"/>
                 <w:sz w:val="26"/>
               </w:rPr>
               <w:t>Artifact #10</w:t>
@@ -1701,6 +1699,8 @@
               <w:t>Biên tập DOCX và kiểm tra hyperlink</w:t>
               <w:br/>
               <w:t>Prompt: sửa format, numbering, hyperlink và đưa nội dung vào report.docx theo cấu trúc mẫu.</w:t>
+              <w:br/>
+              <w:t>Thời gian: 24–26/09/2026 (timestamp chi tiết đối chiếu Prompt log)</w:t>
             </w:r>
           </w:p>
         </w:tc>

</xml_diff>

<commit_message>
Normalize AI audit prompt fields
</commit_message>
<xml_diff>
--- a/HW#01 - Job Description/[AI-02] - FIT@HCMUS - AI Audit Report_Vn_filled.docx
+++ b/HW#01 - Job Description/[AI-02] - FIT@HCMUS - AI Audit Report_Vn_filled.docx
@@ -829,23 +829,22 @@
             <w:tcW w:w="2154" w:type="dxa"/>
           </w:tcPr>
           <w:p>
+            <w:r/>
             <w:r>
               <w:rPr>
                 <w:rFonts w:ascii="Times New Roman" w:hAnsi="Times New Roman" w:eastAsia="Times New Roman"/>
                 <w:b w:val="0"/>
                 <w:sz w:val="26"/>
               </w:rPr>
-              <w:t>Artifact #1</w:t>
+              <w:t>Artifact #1 – Requirement 1: trích xuất thông tin JD</w:t>
               <w:br/>
-              <w:t>Requirement 1 – trích xuất thông tin JD</w:t>
+              <w:t>Tool: ChatGPT/Codex</w:t>
               <w:br/>
-              <w:t>Prompt tóm tắt: "bắt đầu với requirement 1 hãy giúp tôi tìm"</w:t>
+              <w:t>Thời gian: 24–26/09/2026</w:t>
               <w:br/>
-              <w:t>Công cụ: ChatGPT/Codex</w:t>
+              <w:t>Prompt:</w:t>
               <w:br/>
-              <w:t>Thời điểm: theo prompt log</w:t>
-              <w:br/>
-              <w:t>Thời gian: 24–26/09/2026 (timestamp chi tiết đối chiếu Prompt log)</w:t>
+              <w:t>"bắt đầu với requirement 1 hãy giúp tôi tìm"</w:t>
             </w:r>
           </w:p>
         </w:tc>
@@ -928,19 +927,22 @@
             <w:tcW w:w="2154" w:type="dxa"/>
           </w:tcPr>
           <w:p>
+            <w:r/>
             <w:r>
               <w:rPr>
                 <w:rFonts w:ascii="Times New Roman" w:hAnsi="Times New Roman" w:eastAsia="Times New Roman"/>
                 <w:b w:val="0"/>
                 <w:sz w:val="26"/>
               </w:rPr>
-              <w:t>Artifact #2</w:t>
+              <w:t>Artifact #2 – Requirement 1: dịch Job Description/Required Skills/Salary</w:t>
               <w:br/>
-              <w:t>Requirement 1 – dịch Job Description/Required Skills/Salary</w:t>
+              <w:t>Tool: ChatGPT/Codex</w:t>
               <w:br/>
-              <w:t>Prompt: yêu cầu dịch phần Job Description và Required Skills sang tiếng Việt, không thay đổi nội dung.</w:t>
+              <w:t>Thời gian: 24–26/09/2026</w:t>
               <w:br/>
-              <w:t>Thời gian: 24–26/09/2026 (timestamp chi tiết đối chiếu Prompt log)</w:t>
+              <w:t>Prompt:</w:t>
+              <w:br/>
+              <w:t>"yêu cầu dịch phần Job Description và Required Skills sang tiếng Việt, không thay đổi nội dung"</w:t>
             </w:r>
           </w:p>
         </w:tc>
@@ -1023,19 +1025,22 @@
             <w:tcW w:w="2154" w:type="dxa"/>
           </w:tcPr>
           <w:p>
+            <w:r/>
             <w:r>
               <w:rPr>
                 <w:rFonts w:ascii="Times New Roman" w:hAnsi="Times New Roman" w:eastAsia="Times New Roman"/>
                 <w:b w:val="0"/>
                 <w:sz w:val="26"/>
               </w:rPr>
-              <w:t>Artifact #3</w:t>
+              <w:t>Artifact #3 – Requirement 1: AI Impact Analysis</w:t>
               <w:br/>
-              <w:t>Requirement 1 – AI Impact Analysis</w:t>
+              <w:t>Tool: ChatGPT/Codex</w:t>
               <w:br/>
-              <w:t>Prompt: viết 1–2 câu AI Impact Analysis, nêu AI hỗ trợ gì cho job và năng lực job giúp gì khi kết hợp AI.</w:t>
+              <w:t>Thời gian: 24–26/09/2026</w:t>
               <w:br/>
-              <w:t>Thời gian: 24–26/09/2026 (timestamp chi tiết đối chiếu Prompt log)</w:t>
+              <w:t>Prompt:</w:t>
+              <w:br/>
+              <w:t>"viết 1–2 câu AI Impact Analysis, nêu AI hỗ trợ gì cho job và năng lực job giúp gì khi kết hợp AI"</w:t>
             </w:r>
           </w:p>
         </w:tc>
@@ -1118,19 +1123,22 @@
             <w:tcW w:w="2154" w:type="dxa"/>
           </w:tcPr>
           <w:p>
+            <w:r/>
             <w:r>
               <w:rPr>
                 <w:rFonts w:ascii="Times New Roman" w:hAnsi="Times New Roman" w:eastAsia="Times New Roman"/>
                 <w:b w:val="0"/>
                 <w:sz w:val="26"/>
               </w:rPr>
-              <w:t>Artifact #4</w:t>
+              <w:t>Artifact #4 – Requirement 1: kiểm tra tuân thủ</w:t>
               <w:br/>
-              <w:t>Requirement 1 – kiểm tra tuân thủ</w:t>
+              <w:t>Tool: ChatGPT/Codex</w:t>
               <w:br/>
-              <w:t>Prompt: kiểm tra JD đầu tiên đã đúng Requirement 1 chưa.</w:t>
+              <w:t>Thời gian: 24–26/09/2026</w:t>
               <w:br/>
-              <w:t>Thời gian: 24–26/09/2026 (timestamp chi tiết đối chiếu Prompt log)</w:t>
+              <w:t>Prompt:</w:t>
+              <w:br/>
+              <w:t>"kiểm tra JD đầu tiên đã đúng Requirement 1 chưa"</w:t>
             </w:r>
           </w:p>
         </w:tc>
@@ -1213,19 +1221,22 @@
             <w:tcW w:w="2154" w:type="dxa"/>
           </w:tcPr>
           <w:p>
+            <w:r/>
             <w:r>
               <w:rPr>
                 <w:rFonts w:ascii="Times New Roman" w:hAnsi="Times New Roman" w:eastAsia="Times New Roman"/>
                 <w:b w:val="0"/>
                 <w:sz w:val="26"/>
               </w:rPr>
-              <w:t>Artifact #5</w:t>
+              <w:t>Artifact #5 – Requirement 2: tìm software defects</w:t>
               <w:br/>
-              <w:t>Requirement 2 – tìm software defects</w:t>
+              <w:t>Tool: ChatGPT/Codex</w:t>
               <w:br/>
-              <w:t>Prompt: tìm software defects publicized between 2022 and 2026.</w:t>
+              <w:t>Thời gian: 24–26/09/2026</w:t>
               <w:br/>
-              <w:t>Thời gian: 24–26/09/2026 (timestamp chi tiết đối chiếu Prompt log)</w:t>
+              <w:t>Prompt:</w:t>
+              <w:br/>
+              <w:t>"tìm software defects publicized between 2022 and 2026"</w:t>
             </w:r>
           </w:p>
         </w:tc>
@@ -1308,19 +1319,22 @@
             <w:tcW w:w="2154" w:type="dxa"/>
           </w:tcPr>
           <w:p>
+            <w:r/>
             <w:r>
               <w:rPr>
                 <w:rFonts w:ascii="Times New Roman" w:hAnsi="Times New Roman" w:eastAsia="Times New Roman"/>
                 <w:b w:val="0"/>
                 <w:sz w:val="26"/>
               </w:rPr>
-              <w:t>Artifact #6</w:t>
+              <w:t>Artifact #6 – Requirement 2: mô tả defect</w:t>
               <w:br/>
-              <w:t>Requirement 2 – mô tả defect</w:t>
+              <w:t>Tool: ChatGPT/Codex</w:t>
               <w:br/>
-              <w:t>Prompt: mỗi defect gồm source link, description, severity, consequences, solution.</w:t>
+              <w:t>Thời gian: 24–26/09/2026</w:t>
               <w:br/>
-              <w:t>Thời gian: 24–26/09/2026 (timestamp chi tiết đối chiếu Prompt log)</w:t>
+              <w:t>Prompt:</w:t>
+              <w:br/>
+              <w:t>"mỗi defect gồm source link, description, severity, consequences, solution"</w:t>
             </w:r>
           </w:p>
         </w:tc>
@@ -1403,19 +1417,22 @@
             <w:tcW w:w="2154" w:type="dxa"/>
           </w:tcPr>
           <w:p>
+            <w:r/>
             <w:r>
               <w:rPr>
                 <w:rFonts w:ascii="Times New Roman" w:hAnsi="Times New Roman" w:eastAsia="Times New Roman"/>
                 <w:b w:val="0"/>
                 <w:sz w:val="26"/>
               </w:rPr>
-              <w:t>Artifact #7</w:t>
+              <w:t>Artifact #7 – Requirement 2: severity/consequences</w:t>
               <w:br/>
-              <w:t>Requirement 2 – severity/consequences</w:t>
+              <w:t>Tool: ChatGPT/Codex</w:t>
               <w:br/>
-              <w:t>Prompt: kiểm tra mức độ nghiêm trọng và hậu quả của từng defect.</w:t>
+              <w:t>Thời gian: 24–26/09/2026</w:t>
               <w:br/>
-              <w:t>Thời gian: 24–26/09/2026 (timestamp chi tiết đối chiếu Prompt log)</w:t>
+              <w:t>Prompt:</w:t>
+              <w:br/>
+              <w:t>"kiểm tra mức độ nghiêm trọng và hậu quả của từng defect"</w:t>
             </w:r>
           </w:p>
         </w:tc>
@@ -1498,19 +1515,22 @@
             <w:tcW w:w="2154" w:type="dxa"/>
           </w:tcPr>
           <w:p>
+            <w:r/>
             <w:r>
               <w:rPr>
                 <w:rFonts w:ascii="Times New Roman" w:hAnsi="Times New Roman" w:eastAsia="Times New Roman"/>
                 <w:b w:val="0"/>
                 <w:sz w:val="26"/>
               </w:rPr>
-              <w:t>Artifact #8</w:t>
+              <w:t>Artifact #8 – Requirement 2: solution và source solution</w:t>
               <w:br/>
-              <w:t>Requirement 2 – solution và source solution</w:t>
+              <w:t>Tool: ChatGPT/Codex</w:t>
               <w:br/>
-              <w:t>Prompt: solution phải ghi cơ chế đã áp dụng để fix, không chỉ ghi update version; sửa link 404/homepage.</w:t>
+              <w:t>Thời gian: 24–26/09/2026</w:t>
               <w:br/>
-              <w:t>Thời gian: 24–26/09/2026 (timestamp chi tiết đối chiếu Prompt log)</w:t>
+              <w:t>Prompt:</w:t>
+              <w:br/>
+              <w:t>"solution phải ghi cơ chế đã áp dụng để fix, không chỉ ghi update version; sửa link 404/homepage"</w:t>
             </w:r>
           </w:p>
         </w:tc>
@@ -1593,19 +1613,22 @@
             <w:tcW w:w="2154" w:type="dxa"/>
           </w:tcPr>
           <w:p>
+            <w:r/>
             <w:r>
               <w:rPr>
                 <w:rFonts w:ascii="Times New Roman" w:hAnsi="Times New Roman" w:eastAsia="Times New Roman"/>
                 <w:b w:val="0"/>
                 <w:sz w:val="26"/>
               </w:rPr>
-              <w:t>Artifact #9</w:t>
+              <w:t>Artifact #9 – AI Hallucination Analysis: Defect 10 và 14</w:t>
               <w:br/>
-              <w:t>AI Hallucination Analysis – Defect 10 và 14</w:t>
+              <w:t>Tool: ChatGPT/Codex</w:t>
               <w:br/>
-              <w:t>Prompt: phân tích nơi AI biased hoặc hallucinates khi giải thích defect.</w:t>
+              <w:t>Thời gian: 24–26/09/2026</w:t>
               <w:br/>
-              <w:t>Thời gian: 24–26/09/2026 (timestamp chi tiết đối chiếu Prompt log)</w:t>
+              <w:t>Prompt:</w:t>
+              <w:br/>
+              <w:t>"phân tích nơi AI biased hoặc hallucinates khi giải thích defect"</w:t>
             </w:r>
           </w:p>
         </w:tc>
@@ -1688,19 +1711,22 @@
             <w:tcW w:w="2154" w:type="dxa"/>
           </w:tcPr>
           <w:p>
+            <w:r/>
             <w:r>
               <w:rPr>
                 <w:rFonts w:ascii="Times New Roman" w:hAnsi="Times New Roman" w:eastAsia="Times New Roman"/>
                 <w:b w:val="0"/>
                 <w:sz w:val="26"/>
               </w:rPr>
-              <w:t>Artifact #10</w:t>
+              <w:t>Artifact #10 – Biên tập DOCX và kiểm tra hyperlink</w:t>
               <w:br/>
-              <w:t>Biên tập DOCX và kiểm tra hyperlink</w:t>
+              <w:t>Tool: ChatGPT/Codex</w:t>
               <w:br/>
-              <w:t>Prompt: sửa format, numbering, hyperlink và đưa nội dung vào report.docx theo cấu trúc mẫu.</w:t>
+              <w:t>Thời gian: 24–26/09/2026</w:t>
               <w:br/>
-              <w:t>Thời gian: 24–26/09/2026 (timestamp chi tiết đối chiếu Prompt log)</w:t>
+              <w:t>Prompt:</w:t>
+              <w:br/>
+              <w:t>"sửa format, numbering, hyperlink và đưa nội dung vào report.docx theo cấu trúc mẫu"</w:t>
             </w:r>
           </w:p>
         </w:tc>

</xml_diff>